<commit_message>
Update Huong dan Docker
</commit_message>
<xml_diff>
--- a/module4/Hướng dẫn Docker.docx
+++ b/module4/Hướng dẫn Docker.docx
@@ -1273,15 +1273,13 @@
           <w:rFonts w:ascii="Arial" w:hAnsi="Arial" w:cs="Arial"/>
           <w:sz w:val="24"/>
           <w:szCs w:val="24"/>
-          <w:lang w:val="de-DE"/>
-        </w:rPr>
-      </w:pPr>
-      <w:r>
-        <w:rPr>
-          <w:rFonts w:ascii="Arial" w:hAnsi="Arial" w:cs="Arial"/>
-          <w:sz w:val="24"/>
-          <w:szCs w:val="24"/>
-          <w:lang w:val="de-DE"/>
+        </w:rPr>
+      </w:pPr>
+      <w:r>
+        <w:rPr>
+          <w:rFonts w:ascii="Arial" w:hAnsi="Arial" w:cs="Arial"/>
+          <w:sz w:val="24"/>
+          <w:szCs w:val="24"/>
         </w:rPr>
         <w:t>User mới là appuser, password là app123.</w:t>
       </w:r>
@@ -2174,7 +2172,6 @@
           <w:rFonts w:ascii="Arial" w:hAnsi="Arial" w:cs="Arial"/>
           <w:sz w:val="24"/>
           <w:szCs w:val="24"/>
-          <w:lang w:val="de-DE"/>
         </w:rPr>
       </w:pPr>
     </w:p>
@@ -2525,8 +2522,2337 @@
         </w:rPr>
         <w:t xml:space="preserve"> rồi test thử API.</w:t>
       </w:r>
+    </w:p>
+    <w:p>
+      <w:pPr>
+        <w:spacing w:after="0"/>
+        <w:rPr>
+          <w:rFonts w:ascii="Arial" w:hAnsi="Arial" w:cs="Arial"/>
+          <w:sz w:val="24"/>
+          <w:szCs w:val="24"/>
+        </w:rPr>
+      </w:pPr>
+    </w:p>
+    <w:p>
+      <w:pPr>
+        <w:spacing w:after="0"/>
+        <w:rPr>
+          <w:rFonts w:ascii="Arial" w:hAnsi="Arial" w:cs="Arial"/>
+          <w:sz w:val="24"/>
+          <w:szCs w:val="24"/>
+        </w:rPr>
+      </w:pPr>
+    </w:p>
+    <w:p>
+      <w:pPr>
+        <w:spacing w:after="0"/>
+        <w:rPr>
+          <w:rFonts w:ascii="Arial" w:hAnsi="Arial" w:cs="Arial"/>
+          <w:sz w:val="24"/>
+          <w:szCs w:val="24"/>
+        </w:rPr>
+      </w:pPr>
+    </w:p>
+    <w:p>
+      <w:pPr>
+        <w:spacing w:after="0"/>
+        <w:rPr>
+          <w:rFonts w:ascii="Arial" w:hAnsi="Arial" w:cs="Arial"/>
+          <w:b/>
+          <w:sz w:val="24"/>
+          <w:szCs w:val="24"/>
+        </w:rPr>
+      </w:pPr>
+      <w:r>
+        <w:rPr>
+          <w:rFonts w:ascii="Arial" w:hAnsi="Arial" w:cs="Arial"/>
+          <w:b/>
+          <w:sz w:val="24"/>
+          <w:szCs w:val="24"/>
+        </w:rPr>
+        <w:t>Tạo Docker Repository</w:t>
+      </w:r>
+    </w:p>
+    <w:p>
+      <w:pPr>
+        <w:spacing w:after="0"/>
+        <w:rPr>
+          <w:rFonts w:ascii="Arial" w:hAnsi="Arial" w:cs="Arial"/>
+          <w:sz w:val="24"/>
+          <w:szCs w:val="24"/>
+        </w:rPr>
+      </w:pPr>
+    </w:p>
+    <w:p>
+      <w:pPr>
+        <w:spacing w:after="0"/>
+        <w:rPr>
+          <w:rFonts w:ascii="Arial" w:hAnsi="Arial" w:cs="Arial"/>
+          <w:sz w:val="24"/>
+          <w:szCs w:val="24"/>
+        </w:rPr>
+      </w:pPr>
+      <w:r>
+        <w:rPr>
+          <w:rFonts w:ascii="Arial" w:hAnsi="Arial" w:cs="Arial"/>
+          <w:sz w:val="24"/>
+          <w:szCs w:val="24"/>
+        </w:rPr>
+        <w:t>Phần này chúng ta dùng source sử dụng MongoDB</w:t>
+      </w:r>
+    </w:p>
+    <w:p>
+      <w:pPr>
+        <w:spacing w:after="0"/>
+        <w:rPr>
+          <w:rFonts w:ascii="Arial" w:hAnsi="Arial" w:cs="Arial"/>
+          <w:sz w:val="24"/>
+          <w:szCs w:val="24"/>
+          <w:lang w:val="de-DE"/>
+        </w:rPr>
+      </w:pPr>
+      <w:r>
+        <w:rPr>
+          <w:rFonts w:ascii="Arial" w:hAnsi="Arial" w:cs="Arial"/>
+          <w:sz w:val="24"/>
+          <w:szCs w:val="24"/>
+          <w:lang w:val="de-DE"/>
+        </w:rPr>
+        <w:t>Đăng nhập Docker Hub</w:t>
+      </w:r>
+      <w:r>
+        <w:rPr>
+          <w:rFonts w:ascii="Arial" w:hAnsi="Arial" w:cs="Arial"/>
+          <w:sz w:val="24"/>
+          <w:szCs w:val="24"/>
+          <w:lang w:val="de-DE"/>
+        </w:rPr>
+        <w:t xml:space="preserve"> https://hub.docker.com/</w:t>
+      </w:r>
+    </w:p>
+    <w:p>
+      <w:pPr>
+        <w:spacing w:after="0"/>
+        <w:rPr>
+          <w:rFonts w:ascii="Arial" w:hAnsi="Arial" w:cs="Arial"/>
+          <w:sz w:val="24"/>
+          <w:szCs w:val="24"/>
+          <w:lang w:val="de-DE"/>
+        </w:rPr>
+      </w:pPr>
+    </w:p>
+    <w:p>
+      <w:pPr>
+        <w:spacing w:after="0"/>
+        <w:jc w:val="center"/>
+        <w:rPr>
+          <w:rFonts w:ascii="Arial" w:hAnsi="Arial" w:cs="Arial"/>
+          <w:sz w:val="24"/>
+          <w:szCs w:val="24"/>
+          <w:lang w:val="de-DE"/>
+        </w:rPr>
+      </w:pPr>
+      <w:r>
+        <w:rPr>
+          <w:rFonts w:ascii="Arial" w:hAnsi="Arial" w:cs="Arial"/>
+          <w:noProof/>
+          <w:sz w:val="24"/>
+          <w:szCs w:val="24"/>
+        </w:rPr>
+        <w:lastRenderedPageBreak/>
+        <w:drawing>
+          <wp:inline distT="0" distB="0" distL="0" distR="0">
+            <wp:extent cx="5006340" cy="2289566"/>
+            <wp:effectExtent l="0" t="0" r="3810" b="0"/>
+            <wp:docPr id="2" name="Picture 2"/>
+            <wp:cNvGraphicFramePr>
+              <a:graphicFrameLocks xmlns:a="http://schemas.openxmlformats.org/drawingml/2006/main" noChangeAspect="1"/>
+            </wp:cNvGraphicFramePr>
+            <a:graphic xmlns:a="http://schemas.openxmlformats.org/drawingml/2006/main">
+              <a:graphicData uri="http://schemas.openxmlformats.org/drawingml/2006/picture">
+                <pic:pic xmlns:pic="http://schemas.openxmlformats.org/drawingml/2006/picture">
+                  <pic:nvPicPr>
+                    <pic:cNvPr id="0" name="Picture 1"/>
+                    <pic:cNvPicPr>
+                      <a:picLocks noChangeAspect="1" noChangeArrowheads="1"/>
+                    </pic:cNvPicPr>
+                  </pic:nvPicPr>
+                  <pic:blipFill>
+                    <a:blip r:embed="rId15">
+                      <a:extLst>
+                        <a:ext uri="{28A0092B-C50C-407E-A947-70E740481C1C}">
+                          <a14:useLocalDpi xmlns:a14="http://schemas.microsoft.com/office/drawing/2010/main" val="0"/>
+                        </a:ext>
+                      </a:extLst>
+                    </a:blip>
+                    <a:srcRect/>
+                    <a:stretch>
+                      <a:fillRect/>
+                    </a:stretch>
+                  </pic:blipFill>
+                  <pic:spPr bwMode="auto">
+                    <a:xfrm>
+                      <a:off x="0" y="0"/>
+                      <a:ext cx="5012612" cy="2292434"/>
+                    </a:xfrm>
+                    <a:prstGeom prst="rect">
+                      <a:avLst/>
+                    </a:prstGeom>
+                    <a:noFill/>
+                    <a:ln>
+                      <a:noFill/>
+                    </a:ln>
+                  </pic:spPr>
+                </pic:pic>
+              </a:graphicData>
+            </a:graphic>
+          </wp:inline>
+        </w:drawing>
+      </w:r>
+    </w:p>
+    <w:p>
+      <w:pPr>
+        <w:spacing w:after="0"/>
+        <w:rPr>
+          <w:rFonts w:ascii="Arial" w:hAnsi="Arial" w:cs="Arial"/>
+          <w:sz w:val="24"/>
+          <w:szCs w:val="24"/>
+          <w:lang w:val="de-DE"/>
+        </w:rPr>
+      </w:pPr>
+    </w:p>
+    <w:p>
+      <w:pPr>
+        <w:spacing w:after="0"/>
+        <w:rPr>
+          <w:rFonts w:ascii="Arial" w:hAnsi="Arial" w:cs="Arial"/>
+          <w:sz w:val="24"/>
+          <w:szCs w:val="24"/>
+          <w:lang w:val="de-DE"/>
+        </w:rPr>
+      </w:pPr>
+      <w:r>
+        <w:rPr>
+          <w:rFonts w:ascii="Arial" w:hAnsi="Arial" w:cs="Arial"/>
+          <w:sz w:val="24"/>
+          <w:szCs w:val="24"/>
+          <w:lang w:val="de-DE"/>
+        </w:rPr>
+        <w:t>Create a repository</w:t>
+      </w:r>
+    </w:p>
+    <w:p>
+      <w:pPr>
+        <w:spacing w:after="0"/>
+        <w:rPr>
+          <w:rFonts w:ascii="Arial" w:hAnsi="Arial" w:cs="Arial"/>
+          <w:sz w:val="24"/>
+          <w:szCs w:val="24"/>
+        </w:rPr>
+      </w:pPr>
+      <w:r>
+        <w:rPr>
+          <w:rFonts w:ascii="Arial" w:hAnsi="Arial" w:cs="Arial"/>
+          <w:sz w:val="24"/>
+          <w:szCs w:val="24"/>
+        </w:rPr>
+        <w:t>Tên repository là account-service</w:t>
+      </w:r>
+    </w:p>
+    <w:p>
+      <w:pPr>
+        <w:spacing w:after="0"/>
+        <w:rPr>
+          <w:rFonts w:ascii="Arial" w:hAnsi="Arial" w:cs="Arial"/>
+          <w:sz w:val="24"/>
+          <w:szCs w:val="24"/>
+        </w:rPr>
+      </w:pPr>
+      <w:r>
+        <w:rPr>
+          <w:rFonts w:ascii="Arial" w:hAnsi="Arial" w:cs="Arial"/>
+          <w:sz w:val="24"/>
+          <w:szCs w:val="24"/>
+        </w:rPr>
+        <w:t>Chọn Public</w:t>
+      </w:r>
+    </w:p>
+    <w:p>
+      <w:pPr>
+        <w:spacing w:after="0"/>
+        <w:rPr>
+          <w:rFonts w:ascii="Arial" w:hAnsi="Arial" w:cs="Arial"/>
+          <w:sz w:val="24"/>
+          <w:szCs w:val="24"/>
+        </w:rPr>
+      </w:pPr>
+    </w:p>
+    <w:p>
+      <w:pPr>
+        <w:spacing w:after="0"/>
+        <w:jc w:val="center"/>
+        <w:rPr>
+          <w:rFonts w:ascii="Arial" w:hAnsi="Arial" w:cs="Arial"/>
+          <w:sz w:val="24"/>
+          <w:szCs w:val="24"/>
+          <w:lang w:val="de-DE"/>
+        </w:rPr>
+      </w:pPr>
+      <w:r>
+        <w:rPr>
+          <w:rFonts w:ascii="Arial" w:hAnsi="Arial" w:cs="Arial"/>
+          <w:noProof/>
+          <w:sz w:val="24"/>
+          <w:szCs w:val="24"/>
+        </w:rPr>
+        <w:drawing>
+          <wp:inline distT="0" distB="0" distL="0" distR="0">
+            <wp:extent cx="4130040" cy="3207437"/>
+            <wp:effectExtent l="0" t="0" r="3810" b="0"/>
+            <wp:docPr id="8" name="Picture 8"/>
+            <wp:cNvGraphicFramePr>
+              <a:graphicFrameLocks xmlns:a="http://schemas.openxmlformats.org/drawingml/2006/main" noChangeAspect="1"/>
+            </wp:cNvGraphicFramePr>
+            <a:graphic xmlns:a="http://schemas.openxmlformats.org/drawingml/2006/main">
+              <a:graphicData uri="http://schemas.openxmlformats.org/drawingml/2006/picture">
+                <pic:pic xmlns:pic="http://schemas.openxmlformats.org/drawingml/2006/picture">
+                  <pic:nvPicPr>
+                    <pic:cNvPr id="0" name="Picture 2"/>
+                    <pic:cNvPicPr>
+                      <a:picLocks noChangeAspect="1" noChangeArrowheads="1"/>
+                    </pic:cNvPicPr>
+                  </pic:nvPicPr>
+                  <pic:blipFill>
+                    <a:blip r:embed="rId16">
+                      <a:extLst>
+                        <a:ext uri="{28A0092B-C50C-407E-A947-70E740481C1C}">
+                          <a14:useLocalDpi xmlns:a14="http://schemas.microsoft.com/office/drawing/2010/main" val="0"/>
+                        </a:ext>
+                      </a:extLst>
+                    </a:blip>
+                    <a:srcRect/>
+                    <a:stretch>
+                      <a:fillRect/>
+                    </a:stretch>
+                  </pic:blipFill>
+                  <pic:spPr bwMode="auto">
+                    <a:xfrm>
+                      <a:off x="0" y="0"/>
+                      <a:ext cx="4136823" cy="3212705"/>
+                    </a:xfrm>
+                    <a:prstGeom prst="rect">
+                      <a:avLst/>
+                    </a:prstGeom>
+                    <a:noFill/>
+                    <a:ln>
+                      <a:noFill/>
+                    </a:ln>
+                  </pic:spPr>
+                </pic:pic>
+              </a:graphicData>
+            </a:graphic>
+          </wp:inline>
+        </w:drawing>
+      </w:r>
+    </w:p>
+    <w:p>
+      <w:pPr>
+        <w:spacing w:after="0"/>
+        <w:rPr>
+          <w:rFonts w:ascii="Arial" w:hAnsi="Arial" w:cs="Arial"/>
+          <w:sz w:val="24"/>
+          <w:szCs w:val="24"/>
+          <w:lang w:val="de-DE"/>
+        </w:rPr>
+      </w:pPr>
+    </w:p>
+    <w:p>
+      <w:pPr>
+        <w:spacing w:after="0"/>
+        <w:rPr>
+          <w:rFonts w:ascii="Arial" w:hAnsi="Arial" w:cs="Arial"/>
+          <w:sz w:val="24"/>
+          <w:szCs w:val="24"/>
+        </w:rPr>
+      </w:pPr>
+      <w:r>
+        <w:rPr>
+          <w:rFonts w:ascii="Arial" w:hAnsi="Arial" w:cs="Arial"/>
+          <w:sz w:val="24"/>
+          <w:szCs w:val="24"/>
+        </w:rPr>
+        <w:t>Quay lại Docker Desktop. Vào Image -&gt; My Hub sẽ thấy Docker Repository vừa tạo.</w:t>
+      </w:r>
+    </w:p>
+    <w:p>
+      <w:pPr>
+        <w:spacing w:after="0"/>
+        <w:rPr>
+          <w:rFonts w:ascii="Arial" w:hAnsi="Arial" w:cs="Arial"/>
+          <w:sz w:val="24"/>
+          <w:szCs w:val="24"/>
+        </w:rPr>
+      </w:pPr>
+    </w:p>
+    <w:p>
+      <w:pPr>
+        <w:spacing w:after="0"/>
+        <w:jc w:val="center"/>
+        <w:rPr>
+          <w:rFonts w:ascii="Arial" w:hAnsi="Arial" w:cs="Arial"/>
+          <w:sz w:val="24"/>
+          <w:szCs w:val="24"/>
+          <w:lang w:val="de-DE"/>
+        </w:rPr>
+      </w:pPr>
+      <w:r>
+        <w:rPr>
+          <w:rFonts w:ascii="Arial" w:hAnsi="Arial" w:cs="Arial"/>
+          <w:noProof/>
+          <w:sz w:val="24"/>
+          <w:szCs w:val="24"/>
+        </w:rPr>
+        <w:drawing>
+          <wp:inline distT="0" distB="0" distL="0" distR="0">
+            <wp:extent cx="5928360" cy="2522272"/>
+            <wp:effectExtent l="0" t="0" r="0" b="0"/>
+            <wp:docPr id="9" name="Picture 9"/>
+            <wp:cNvGraphicFramePr>
+              <a:graphicFrameLocks xmlns:a="http://schemas.openxmlformats.org/drawingml/2006/main" noChangeAspect="1"/>
+            </wp:cNvGraphicFramePr>
+            <a:graphic xmlns:a="http://schemas.openxmlformats.org/drawingml/2006/main">
+              <a:graphicData uri="http://schemas.openxmlformats.org/drawingml/2006/picture">
+                <pic:pic xmlns:pic="http://schemas.openxmlformats.org/drawingml/2006/picture">
+                  <pic:nvPicPr>
+                    <pic:cNvPr id="0" name="Picture 3"/>
+                    <pic:cNvPicPr>
+                      <a:picLocks noChangeAspect="1" noChangeArrowheads="1"/>
+                    </pic:cNvPicPr>
+                  </pic:nvPicPr>
+                  <pic:blipFill>
+                    <a:blip r:embed="rId17">
+                      <a:extLst>
+                        <a:ext uri="{28A0092B-C50C-407E-A947-70E740481C1C}">
+                          <a14:useLocalDpi xmlns:a14="http://schemas.microsoft.com/office/drawing/2010/main" val="0"/>
+                        </a:ext>
+                      </a:extLst>
+                    </a:blip>
+                    <a:srcRect/>
+                    <a:stretch>
+                      <a:fillRect/>
+                    </a:stretch>
+                  </pic:blipFill>
+                  <pic:spPr bwMode="auto">
+                    <a:xfrm>
+                      <a:off x="0" y="0"/>
+                      <a:ext cx="5932203" cy="2523907"/>
+                    </a:xfrm>
+                    <a:prstGeom prst="rect">
+                      <a:avLst/>
+                    </a:prstGeom>
+                    <a:noFill/>
+                    <a:ln>
+                      <a:noFill/>
+                    </a:ln>
+                  </pic:spPr>
+                </pic:pic>
+              </a:graphicData>
+            </a:graphic>
+          </wp:inline>
+        </w:drawing>
+      </w:r>
+    </w:p>
+    <w:p>
+      <w:pPr>
+        <w:spacing w:after="0"/>
+        <w:rPr>
+          <w:rFonts w:ascii="Arial" w:hAnsi="Arial" w:cs="Arial"/>
+          <w:sz w:val="24"/>
+          <w:szCs w:val="24"/>
+          <w:lang w:val="de-DE"/>
+        </w:rPr>
+      </w:pPr>
+    </w:p>
+    <w:p>
+      <w:pPr>
+        <w:spacing w:after="0"/>
+        <w:rPr>
+          <w:rFonts w:ascii="Arial" w:hAnsi="Arial" w:cs="Arial"/>
+          <w:sz w:val="24"/>
+          <w:szCs w:val="24"/>
+          <w:lang w:val="de-DE"/>
+        </w:rPr>
+      </w:pPr>
+    </w:p>
+    <w:p>
+      <w:pPr>
+        <w:spacing w:after="0"/>
+        <w:rPr>
+          <w:rFonts w:ascii="Arial" w:hAnsi="Arial" w:cs="Arial"/>
+          <w:b/>
+          <w:sz w:val="24"/>
+          <w:szCs w:val="24"/>
+        </w:rPr>
+      </w:pPr>
+      <w:r>
+        <w:rPr>
+          <w:rFonts w:ascii="Arial" w:hAnsi="Arial" w:cs="Arial"/>
+          <w:b/>
+          <w:sz w:val="24"/>
+          <w:szCs w:val="24"/>
+        </w:rPr>
+        <w:t>Upload Docker image lên Docker Repository</w:t>
+      </w:r>
+    </w:p>
+    <w:p>
+      <w:pPr>
+        <w:spacing w:after="0"/>
+        <w:rPr>
+          <w:rFonts w:ascii="Arial" w:hAnsi="Arial" w:cs="Arial"/>
+          <w:sz w:val="24"/>
+          <w:szCs w:val="24"/>
+        </w:rPr>
+      </w:pPr>
+    </w:p>
+    <w:p>
+      <w:pPr>
+        <w:spacing w:after="0"/>
+        <w:rPr>
+          <w:rFonts w:ascii="Arial" w:hAnsi="Arial" w:cs="Arial"/>
+          <w:sz w:val="24"/>
+          <w:szCs w:val="24"/>
+        </w:rPr>
+      </w:pPr>
+      <w:r>
+        <w:rPr>
+          <w:rFonts w:ascii="Arial" w:hAnsi="Arial" w:cs="Arial"/>
+          <w:sz w:val="24"/>
+          <w:szCs w:val="24"/>
+        </w:rPr>
+        <w:t>Mở PowerShell gõ</w:t>
+      </w:r>
+    </w:p>
+    <w:p>
+      <w:pPr>
+        <w:spacing w:after="0"/>
+        <w:rPr>
+          <w:rFonts w:ascii="Arial" w:hAnsi="Arial" w:cs="Arial"/>
+          <w:sz w:val="24"/>
+          <w:szCs w:val="24"/>
+        </w:rPr>
+      </w:pPr>
+    </w:p>
+    <w:p>
+      <w:pPr>
+        <w:spacing w:after="0"/>
+        <w:rPr>
+          <w:rFonts w:ascii="Arial" w:hAnsi="Arial" w:cs="Arial"/>
+          <w:sz w:val="24"/>
+          <w:szCs w:val="24"/>
+        </w:rPr>
+      </w:pPr>
+      <w:r>
+        <w:rPr>
+          <w:rFonts w:ascii="Arial" w:hAnsi="Arial" w:cs="Arial"/>
+          <w:sz w:val="24"/>
+          <w:szCs w:val="24"/>
+        </w:rPr>
+        <w:t>docker tag &lt;tên docker image&gt; &lt;tên account&gt;/&lt;tên repo&gt;:&lt;tên docker image trên hub&gt;</w:t>
+      </w:r>
+    </w:p>
+    <w:p>
+      <w:pPr>
+        <w:spacing w:after="0"/>
+        <w:rPr>
+          <w:rFonts w:ascii="Arial" w:hAnsi="Arial" w:cs="Arial"/>
+          <w:sz w:val="24"/>
+          <w:szCs w:val="24"/>
+        </w:rPr>
+      </w:pPr>
+    </w:p>
+    <w:p>
+      <w:pPr>
+        <w:spacing w:after="0"/>
+        <w:rPr>
+          <w:rFonts w:ascii="Arial" w:hAnsi="Arial" w:cs="Arial"/>
+          <w:sz w:val="24"/>
+          <w:szCs w:val="24"/>
+        </w:rPr>
+      </w:pPr>
+      <w:r>
+        <w:rPr>
+          <w:rFonts w:ascii="Arial" w:hAnsi="Arial" w:cs="Arial"/>
+          <w:sz w:val="24"/>
+          <w:szCs w:val="24"/>
+        </w:rPr>
+        <w:t>Tên account và tên repo copy từ repository</w:t>
+      </w:r>
+    </w:p>
+    <w:p>
+      <w:pPr>
+        <w:spacing w:after="0"/>
+        <w:rPr>
+          <w:rFonts w:ascii="Arial" w:hAnsi="Arial" w:cs="Arial"/>
+          <w:sz w:val="24"/>
+          <w:szCs w:val="24"/>
+        </w:rPr>
+      </w:pPr>
+    </w:p>
+    <w:p>
+      <w:pPr>
+        <w:spacing w:after="0"/>
+        <w:jc w:val="center"/>
+        <w:rPr>
+          <w:rFonts w:ascii="Arial" w:hAnsi="Arial" w:cs="Arial"/>
+          <w:sz w:val="24"/>
+          <w:szCs w:val="24"/>
+        </w:rPr>
+      </w:pPr>
+      <w:r>
+        <w:rPr>
+          <w:rFonts w:ascii="Arial" w:hAnsi="Arial" w:cs="Arial"/>
+          <w:noProof/>
+          <w:sz w:val="24"/>
+          <w:szCs w:val="24"/>
+        </w:rPr>
+        <w:drawing>
+          <wp:inline distT="0" distB="0" distL="0" distR="0">
+            <wp:extent cx="3162300" cy="1242060"/>
+            <wp:effectExtent l="0" t="0" r="0" b="0"/>
+            <wp:docPr id="16" name="Picture 16"/>
+            <wp:cNvGraphicFramePr>
+              <a:graphicFrameLocks xmlns:a="http://schemas.openxmlformats.org/drawingml/2006/main" noChangeAspect="1"/>
+            </wp:cNvGraphicFramePr>
+            <a:graphic xmlns:a="http://schemas.openxmlformats.org/drawingml/2006/main">
+              <a:graphicData uri="http://schemas.openxmlformats.org/drawingml/2006/picture">
+                <pic:pic xmlns:pic="http://schemas.openxmlformats.org/drawingml/2006/picture">
+                  <pic:nvPicPr>
+                    <pic:cNvPr id="0" name="Picture 5"/>
+                    <pic:cNvPicPr>
+                      <a:picLocks noChangeAspect="1" noChangeArrowheads="1"/>
+                    </pic:cNvPicPr>
+                  </pic:nvPicPr>
+                  <pic:blipFill>
+                    <a:blip r:embed="rId18">
+                      <a:extLst>
+                        <a:ext uri="{28A0092B-C50C-407E-A947-70E740481C1C}">
+                          <a14:useLocalDpi xmlns:a14="http://schemas.microsoft.com/office/drawing/2010/main" val="0"/>
+                        </a:ext>
+                      </a:extLst>
+                    </a:blip>
+                    <a:srcRect/>
+                    <a:stretch>
+                      <a:fillRect/>
+                    </a:stretch>
+                  </pic:blipFill>
+                  <pic:spPr bwMode="auto">
+                    <a:xfrm>
+                      <a:off x="0" y="0"/>
+                      <a:ext cx="3162300" cy="1242060"/>
+                    </a:xfrm>
+                    <a:prstGeom prst="rect">
+                      <a:avLst/>
+                    </a:prstGeom>
+                    <a:noFill/>
+                    <a:ln>
+                      <a:noFill/>
+                    </a:ln>
+                  </pic:spPr>
+                </pic:pic>
+              </a:graphicData>
+            </a:graphic>
+          </wp:inline>
+        </w:drawing>
+      </w:r>
+    </w:p>
+    <w:p>
+      <w:pPr>
+        <w:spacing w:after="0"/>
+        <w:rPr>
+          <w:rFonts w:ascii="Arial" w:hAnsi="Arial" w:cs="Arial"/>
+          <w:sz w:val="24"/>
+          <w:szCs w:val="24"/>
+        </w:rPr>
+      </w:pPr>
+    </w:p>
+    <w:p>
+      <w:pPr>
+        <w:spacing w:after="0"/>
+        <w:rPr>
+          <w:rFonts w:ascii="Arial" w:hAnsi="Arial" w:cs="Arial"/>
+          <w:sz w:val="24"/>
+          <w:szCs w:val="24"/>
+        </w:rPr>
+      </w:pPr>
+      <w:r>
+        <w:rPr>
+          <w:rFonts w:ascii="Arial" w:hAnsi="Arial" w:cs="Arial"/>
+          <w:sz w:val="24"/>
+          <w:szCs w:val="24"/>
+        </w:rPr>
+        <w:t>docker tag account-service:1.0 nvhai061993/account-service:1.0</w:t>
+      </w:r>
+    </w:p>
+    <w:p>
+      <w:pPr>
+        <w:spacing w:after="0"/>
+        <w:rPr>
+          <w:rFonts w:ascii="Arial" w:hAnsi="Arial" w:cs="Arial"/>
+          <w:sz w:val="24"/>
+          <w:szCs w:val="24"/>
+        </w:rPr>
+      </w:pPr>
+    </w:p>
+    <w:p>
+      <w:pPr>
+        <w:spacing w:after="0"/>
+        <w:rPr>
+          <w:rFonts w:ascii="Arial" w:hAnsi="Arial" w:cs="Arial"/>
+          <w:sz w:val="24"/>
+          <w:szCs w:val="24"/>
+        </w:rPr>
+      </w:pPr>
+      <w:r>
+        <w:rPr>
+          <w:rFonts w:ascii="Arial" w:hAnsi="Arial" w:cs="Arial"/>
+          <w:sz w:val="24"/>
+          <w:szCs w:val="24"/>
+        </w:rPr>
+        <w:t>Kết quả:</w:t>
+      </w:r>
+      <w:r>
+        <w:rPr>
+          <w:rFonts w:ascii="Arial" w:hAnsi="Arial" w:cs="Arial"/>
+          <w:sz w:val="24"/>
+          <w:szCs w:val="24"/>
+        </w:rPr>
+        <w:t xml:space="preserve"> </w:t>
+      </w:r>
+      <w:r>
+        <w:rPr>
+          <w:rFonts w:ascii="Arial" w:hAnsi="Arial" w:cs="Arial"/>
+          <w:sz w:val="24"/>
+          <w:szCs w:val="24"/>
+        </w:rPr>
+        <w:t>repository đã xuất hiện trong image</w:t>
+      </w:r>
+    </w:p>
+    <w:p>
+      <w:pPr>
+        <w:spacing w:after="0"/>
+        <w:rPr>
+          <w:rFonts w:ascii="Arial" w:hAnsi="Arial" w:cs="Arial"/>
+          <w:sz w:val="24"/>
+          <w:szCs w:val="24"/>
+        </w:rPr>
+      </w:pPr>
+    </w:p>
+    <w:p>
+      <w:pPr>
+        <w:spacing w:after="0"/>
+        <w:rPr>
+          <w:rFonts w:ascii="Arial" w:hAnsi="Arial" w:cs="Arial"/>
+          <w:sz w:val="24"/>
+          <w:szCs w:val="24"/>
+        </w:rPr>
+      </w:pPr>
+    </w:p>
+    <w:p>
+      <w:pPr>
+        <w:spacing w:after="0"/>
+        <w:rPr>
+          <w:rFonts w:ascii="Arial" w:hAnsi="Arial" w:cs="Arial"/>
+          <w:sz w:val="24"/>
+          <w:szCs w:val="24"/>
+        </w:rPr>
+      </w:pPr>
+      <w:r>
+        <w:rPr>
+          <w:rFonts w:ascii="Arial" w:hAnsi="Arial" w:cs="Arial"/>
+          <w:noProof/>
+          <w:sz w:val="24"/>
+          <w:szCs w:val="24"/>
+        </w:rPr>
+        <w:drawing>
+          <wp:inline distT="0" distB="0" distL="0" distR="0">
+            <wp:extent cx="6637020" cy="647700"/>
+            <wp:effectExtent l="0" t="0" r="0" b="0"/>
+            <wp:docPr id="15" name="Picture 15"/>
+            <wp:cNvGraphicFramePr>
+              <a:graphicFrameLocks xmlns:a="http://schemas.openxmlformats.org/drawingml/2006/main" noChangeAspect="1"/>
+            </wp:cNvGraphicFramePr>
+            <a:graphic xmlns:a="http://schemas.openxmlformats.org/drawingml/2006/main">
+              <a:graphicData uri="http://schemas.openxmlformats.org/drawingml/2006/picture">
+                <pic:pic xmlns:pic="http://schemas.openxmlformats.org/drawingml/2006/picture">
+                  <pic:nvPicPr>
+                    <pic:cNvPr id="0" name="Picture 4"/>
+                    <pic:cNvPicPr>
+                      <a:picLocks noChangeAspect="1" noChangeArrowheads="1"/>
+                    </pic:cNvPicPr>
+                  </pic:nvPicPr>
+                  <pic:blipFill>
+                    <a:blip r:embed="rId19">
+                      <a:extLst>
+                        <a:ext uri="{28A0092B-C50C-407E-A947-70E740481C1C}">
+                          <a14:useLocalDpi xmlns:a14="http://schemas.microsoft.com/office/drawing/2010/main" val="0"/>
+                        </a:ext>
+                      </a:extLst>
+                    </a:blip>
+                    <a:srcRect/>
+                    <a:stretch>
+                      <a:fillRect/>
+                    </a:stretch>
+                  </pic:blipFill>
+                  <pic:spPr bwMode="auto">
+                    <a:xfrm>
+                      <a:off x="0" y="0"/>
+                      <a:ext cx="6637020" cy="647700"/>
+                    </a:xfrm>
+                    <a:prstGeom prst="rect">
+                      <a:avLst/>
+                    </a:prstGeom>
+                    <a:noFill/>
+                    <a:ln>
+                      <a:noFill/>
+                    </a:ln>
+                  </pic:spPr>
+                </pic:pic>
+              </a:graphicData>
+            </a:graphic>
+          </wp:inline>
+        </w:drawing>
+      </w:r>
+    </w:p>
+    <w:p>
+      <w:pPr>
+        <w:spacing w:after="0"/>
+        <w:rPr>
+          <w:rFonts w:ascii="Arial" w:hAnsi="Arial" w:cs="Arial"/>
+          <w:sz w:val="24"/>
+          <w:szCs w:val="24"/>
+        </w:rPr>
+      </w:pPr>
+    </w:p>
+    <w:p>
+      <w:pPr>
+        <w:spacing w:after="0"/>
+        <w:rPr>
+          <w:rFonts w:ascii="Arial" w:hAnsi="Arial" w:cs="Arial"/>
+          <w:b/>
+          <w:sz w:val="24"/>
+          <w:szCs w:val="24"/>
+        </w:rPr>
+      </w:pPr>
+      <w:r>
+        <w:rPr>
+          <w:rFonts w:ascii="Arial" w:hAnsi="Arial" w:cs="Arial"/>
+          <w:b/>
+          <w:sz w:val="24"/>
+          <w:szCs w:val="24"/>
+        </w:rPr>
+        <w:t>Push Image lên Repository</w:t>
+      </w:r>
+    </w:p>
+    <w:p>
+      <w:pPr>
+        <w:spacing w:after="0"/>
+        <w:rPr>
+          <w:rFonts w:ascii="Arial" w:hAnsi="Arial" w:cs="Arial"/>
+          <w:sz w:val="24"/>
+          <w:szCs w:val="24"/>
+        </w:rPr>
+      </w:pPr>
+    </w:p>
+    <w:p>
+      <w:pPr>
+        <w:spacing w:after="0"/>
+        <w:rPr>
+          <w:rFonts w:ascii="Arial" w:hAnsi="Arial" w:cs="Arial"/>
+          <w:sz w:val="24"/>
+          <w:szCs w:val="24"/>
+        </w:rPr>
+      </w:pPr>
+      <w:r>
+        <w:rPr>
+          <w:rFonts w:ascii="Arial" w:hAnsi="Arial" w:cs="Arial"/>
+          <w:sz w:val="24"/>
+          <w:szCs w:val="24"/>
+        </w:rPr>
+        <w:t>docker push &lt;tên account&gt;/&lt;tên repo&gt;:&lt;tên docker image trên hub&gt;</w:t>
+      </w:r>
+    </w:p>
+    <w:p>
+      <w:pPr>
+        <w:spacing w:after="0"/>
+        <w:rPr>
+          <w:rFonts w:ascii="Arial" w:hAnsi="Arial" w:cs="Arial"/>
+          <w:sz w:val="24"/>
+          <w:szCs w:val="24"/>
+        </w:rPr>
+      </w:pPr>
+    </w:p>
+    <w:p>
+      <w:pPr>
+        <w:spacing w:after="0"/>
+        <w:rPr>
+          <w:rFonts w:ascii="Arial" w:hAnsi="Arial" w:cs="Arial"/>
+          <w:sz w:val="24"/>
+          <w:szCs w:val="24"/>
+        </w:rPr>
+      </w:pPr>
+      <w:r>
+        <w:rPr>
+          <w:rFonts w:ascii="Arial" w:hAnsi="Arial" w:cs="Arial"/>
+          <w:sz w:val="24"/>
+          <w:szCs w:val="24"/>
+        </w:rPr>
+        <w:t xml:space="preserve">docker push </w:t>
+      </w:r>
+      <w:r>
+        <w:rPr>
+          <w:rFonts w:ascii="Arial" w:hAnsi="Arial" w:cs="Arial"/>
+          <w:sz w:val="24"/>
+          <w:szCs w:val="24"/>
+        </w:rPr>
+        <w:t>nvhai061993/account-service:1.0</w:t>
+      </w:r>
+    </w:p>
+    <w:p>
+      <w:pPr>
+        <w:spacing w:after="0"/>
+        <w:rPr>
+          <w:rFonts w:ascii="Arial" w:hAnsi="Arial" w:cs="Arial"/>
+          <w:sz w:val="24"/>
+          <w:szCs w:val="24"/>
+        </w:rPr>
+      </w:pPr>
+    </w:p>
+    <w:p>
+      <w:pPr>
+        <w:spacing w:after="0"/>
+        <w:jc w:val="center"/>
+        <w:rPr>
+          <w:rFonts w:ascii="Arial" w:hAnsi="Arial" w:cs="Arial"/>
+          <w:sz w:val="24"/>
+          <w:szCs w:val="24"/>
+        </w:rPr>
+      </w:pPr>
+      <w:r>
+        <w:rPr>
+          <w:rFonts w:ascii="Arial" w:hAnsi="Arial" w:cs="Arial"/>
+          <w:noProof/>
+          <w:sz w:val="24"/>
+          <w:szCs w:val="24"/>
+        </w:rPr>
+        <w:drawing>
+          <wp:inline distT="0" distB="0" distL="0" distR="0">
+            <wp:extent cx="5730240" cy="1584960"/>
+            <wp:effectExtent l="0" t="0" r="3810" b="0"/>
+            <wp:docPr id="17" name="Picture 17"/>
+            <wp:cNvGraphicFramePr>
+              <a:graphicFrameLocks xmlns:a="http://schemas.openxmlformats.org/drawingml/2006/main" noChangeAspect="1"/>
+            </wp:cNvGraphicFramePr>
+            <a:graphic xmlns:a="http://schemas.openxmlformats.org/drawingml/2006/main">
+              <a:graphicData uri="http://schemas.openxmlformats.org/drawingml/2006/picture">
+                <pic:pic xmlns:pic="http://schemas.openxmlformats.org/drawingml/2006/picture">
+                  <pic:nvPicPr>
+                    <pic:cNvPr id="0" name="Picture 6"/>
+                    <pic:cNvPicPr>
+                      <a:picLocks noChangeAspect="1" noChangeArrowheads="1"/>
+                    </pic:cNvPicPr>
+                  </pic:nvPicPr>
+                  <pic:blipFill>
+                    <a:blip r:embed="rId20">
+                      <a:extLst>
+                        <a:ext uri="{28A0092B-C50C-407E-A947-70E740481C1C}">
+                          <a14:useLocalDpi xmlns:a14="http://schemas.microsoft.com/office/drawing/2010/main" val="0"/>
+                        </a:ext>
+                      </a:extLst>
+                    </a:blip>
+                    <a:srcRect/>
+                    <a:stretch>
+                      <a:fillRect/>
+                    </a:stretch>
+                  </pic:blipFill>
+                  <pic:spPr bwMode="auto">
+                    <a:xfrm>
+                      <a:off x="0" y="0"/>
+                      <a:ext cx="5730240" cy="1584960"/>
+                    </a:xfrm>
+                    <a:prstGeom prst="rect">
+                      <a:avLst/>
+                    </a:prstGeom>
+                    <a:noFill/>
+                    <a:ln>
+                      <a:noFill/>
+                    </a:ln>
+                  </pic:spPr>
+                </pic:pic>
+              </a:graphicData>
+            </a:graphic>
+          </wp:inline>
+        </w:drawing>
+      </w:r>
+    </w:p>
+    <w:p>
+      <w:pPr>
+        <w:spacing w:after="0"/>
+        <w:rPr>
+          <w:rFonts w:ascii="Arial" w:hAnsi="Arial" w:cs="Arial"/>
+          <w:sz w:val="24"/>
+          <w:szCs w:val="24"/>
+        </w:rPr>
+      </w:pPr>
+    </w:p>
+    <w:p>
+      <w:pPr>
+        <w:spacing w:after="0"/>
+        <w:rPr>
+          <w:rFonts w:ascii="Arial" w:hAnsi="Arial" w:cs="Arial"/>
+          <w:sz w:val="24"/>
+          <w:szCs w:val="24"/>
+        </w:rPr>
+      </w:pPr>
+      <w:r>
+        <w:rPr>
+          <w:rFonts w:ascii="Arial" w:hAnsi="Arial" w:cs="Arial"/>
+          <w:sz w:val="24"/>
+          <w:szCs w:val="24"/>
+        </w:rPr>
+        <w:t>Kết quả: vào trang hub.docker.com sẽ thấy một image vừa được pushed less than a minute</w:t>
+      </w:r>
+    </w:p>
+    <w:p>
+      <w:pPr>
+        <w:spacing w:after="0"/>
+        <w:rPr>
+          <w:rFonts w:ascii="Arial" w:hAnsi="Arial" w:cs="Arial"/>
+          <w:sz w:val="24"/>
+          <w:szCs w:val="24"/>
+        </w:rPr>
+      </w:pPr>
+    </w:p>
+    <w:p>
+      <w:pPr>
+        <w:spacing w:after="0"/>
+        <w:rPr>
+          <w:rFonts w:ascii="Arial" w:hAnsi="Arial" w:cs="Arial"/>
+          <w:sz w:val="24"/>
+          <w:szCs w:val="24"/>
+        </w:rPr>
+      </w:pPr>
+      <w:r>
+        <w:rPr>
+          <w:rFonts w:ascii="Arial" w:hAnsi="Arial" w:cs="Arial"/>
+          <w:noProof/>
+          <w:sz w:val="24"/>
+          <w:szCs w:val="24"/>
+        </w:rPr>
+        <w:lastRenderedPageBreak/>
+        <w:drawing>
+          <wp:inline distT="0" distB="0" distL="0" distR="0">
+            <wp:extent cx="6644640" cy="4168140"/>
+            <wp:effectExtent l="0" t="0" r="3810" b="3810"/>
+            <wp:docPr id="18" name="Picture 18"/>
+            <wp:cNvGraphicFramePr>
+              <a:graphicFrameLocks xmlns:a="http://schemas.openxmlformats.org/drawingml/2006/main" noChangeAspect="1"/>
+            </wp:cNvGraphicFramePr>
+            <a:graphic xmlns:a="http://schemas.openxmlformats.org/drawingml/2006/main">
+              <a:graphicData uri="http://schemas.openxmlformats.org/drawingml/2006/picture">
+                <pic:pic xmlns:pic="http://schemas.openxmlformats.org/drawingml/2006/picture">
+                  <pic:nvPicPr>
+                    <pic:cNvPr id="0" name="Picture 7"/>
+                    <pic:cNvPicPr>
+                      <a:picLocks noChangeAspect="1" noChangeArrowheads="1"/>
+                    </pic:cNvPicPr>
+                  </pic:nvPicPr>
+                  <pic:blipFill>
+                    <a:blip r:embed="rId21">
+                      <a:extLst>
+                        <a:ext uri="{28A0092B-C50C-407E-A947-70E740481C1C}">
+                          <a14:useLocalDpi xmlns:a14="http://schemas.microsoft.com/office/drawing/2010/main" val="0"/>
+                        </a:ext>
+                      </a:extLst>
+                    </a:blip>
+                    <a:srcRect/>
+                    <a:stretch>
+                      <a:fillRect/>
+                    </a:stretch>
+                  </pic:blipFill>
+                  <pic:spPr bwMode="auto">
+                    <a:xfrm>
+                      <a:off x="0" y="0"/>
+                      <a:ext cx="6644640" cy="4168140"/>
+                    </a:xfrm>
+                    <a:prstGeom prst="rect">
+                      <a:avLst/>
+                    </a:prstGeom>
+                    <a:noFill/>
+                    <a:ln>
+                      <a:noFill/>
+                    </a:ln>
+                  </pic:spPr>
+                </pic:pic>
+              </a:graphicData>
+            </a:graphic>
+          </wp:inline>
+        </w:drawing>
+      </w:r>
+    </w:p>
+    <w:p>
+      <w:pPr>
+        <w:spacing w:after="0"/>
+        <w:rPr>
+          <w:rFonts w:ascii="Arial" w:hAnsi="Arial" w:cs="Arial"/>
+          <w:sz w:val="24"/>
+          <w:szCs w:val="24"/>
+        </w:rPr>
+      </w:pPr>
+    </w:p>
+    <w:p>
+      <w:pPr>
+        <w:spacing w:after="0"/>
+        <w:rPr>
+          <w:rFonts w:ascii="Arial" w:hAnsi="Arial" w:cs="Arial"/>
+          <w:sz w:val="24"/>
+          <w:szCs w:val="24"/>
+        </w:rPr>
+      </w:pPr>
+      <w:r>
+        <w:rPr>
+          <w:rFonts w:ascii="Arial" w:hAnsi="Arial" w:cs="Arial"/>
+          <w:sz w:val="24"/>
+          <w:szCs w:val="24"/>
+        </w:rPr>
+        <w:t>Hoặc có thể xem trong My Hub ở Docker Desktop</w:t>
+      </w:r>
+    </w:p>
+    <w:p>
+      <w:pPr>
+        <w:spacing w:after="0"/>
+        <w:rPr>
+          <w:rFonts w:ascii="Arial" w:hAnsi="Arial" w:cs="Arial"/>
+          <w:sz w:val="24"/>
+          <w:szCs w:val="24"/>
+        </w:rPr>
+      </w:pPr>
+    </w:p>
+    <w:p>
+      <w:pPr>
+        <w:spacing w:after="0"/>
+        <w:rPr>
+          <w:rFonts w:ascii="Arial" w:hAnsi="Arial" w:cs="Arial"/>
+          <w:sz w:val="24"/>
+          <w:szCs w:val="24"/>
+        </w:rPr>
+      </w:pPr>
+      <w:r>
+        <w:rPr>
+          <w:rFonts w:ascii="Arial" w:hAnsi="Arial" w:cs="Arial"/>
+          <w:noProof/>
+          <w:sz w:val="24"/>
+          <w:szCs w:val="24"/>
+        </w:rPr>
+        <w:drawing>
+          <wp:inline distT="0" distB="0" distL="0" distR="0">
+            <wp:extent cx="6637020" cy="1684020"/>
+            <wp:effectExtent l="0" t="0" r="0" b="0"/>
+            <wp:docPr id="19" name="Picture 19"/>
+            <wp:cNvGraphicFramePr>
+              <a:graphicFrameLocks xmlns:a="http://schemas.openxmlformats.org/drawingml/2006/main" noChangeAspect="1"/>
+            </wp:cNvGraphicFramePr>
+            <a:graphic xmlns:a="http://schemas.openxmlformats.org/drawingml/2006/main">
+              <a:graphicData uri="http://schemas.openxmlformats.org/drawingml/2006/picture">
+                <pic:pic xmlns:pic="http://schemas.openxmlformats.org/drawingml/2006/picture">
+                  <pic:nvPicPr>
+                    <pic:cNvPr id="0" name="Picture 8"/>
+                    <pic:cNvPicPr>
+                      <a:picLocks noChangeAspect="1" noChangeArrowheads="1"/>
+                    </pic:cNvPicPr>
+                  </pic:nvPicPr>
+                  <pic:blipFill>
+                    <a:blip r:embed="rId22">
+                      <a:extLst>
+                        <a:ext uri="{28A0092B-C50C-407E-A947-70E740481C1C}">
+                          <a14:useLocalDpi xmlns:a14="http://schemas.microsoft.com/office/drawing/2010/main" val="0"/>
+                        </a:ext>
+                      </a:extLst>
+                    </a:blip>
+                    <a:srcRect/>
+                    <a:stretch>
+                      <a:fillRect/>
+                    </a:stretch>
+                  </pic:blipFill>
+                  <pic:spPr bwMode="auto">
+                    <a:xfrm>
+                      <a:off x="0" y="0"/>
+                      <a:ext cx="6637020" cy="1684020"/>
+                    </a:xfrm>
+                    <a:prstGeom prst="rect">
+                      <a:avLst/>
+                    </a:prstGeom>
+                    <a:noFill/>
+                    <a:ln>
+                      <a:noFill/>
+                    </a:ln>
+                  </pic:spPr>
+                </pic:pic>
+              </a:graphicData>
+            </a:graphic>
+          </wp:inline>
+        </w:drawing>
+      </w:r>
+    </w:p>
+    <w:p>
+      <w:pPr>
+        <w:spacing w:after="0"/>
+        <w:rPr>
+          <w:rFonts w:ascii="Arial" w:hAnsi="Arial" w:cs="Arial"/>
+          <w:sz w:val="24"/>
+          <w:szCs w:val="24"/>
+        </w:rPr>
+      </w:pPr>
+    </w:p>
+    <w:p>
+      <w:pPr>
+        <w:spacing w:after="0"/>
+        <w:rPr>
+          <w:rFonts w:ascii="Arial" w:hAnsi="Arial" w:cs="Arial"/>
+          <w:sz w:val="24"/>
+          <w:szCs w:val="24"/>
+        </w:rPr>
+      </w:pPr>
+    </w:p>
+    <w:p>
+      <w:pPr>
+        <w:spacing w:after="0"/>
+        <w:rPr>
+          <w:rFonts w:ascii="Arial" w:hAnsi="Arial" w:cs="Arial"/>
+          <w:sz w:val="24"/>
+          <w:szCs w:val="24"/>
+        </w:rPr>
+      </w:pPr>
+    </w:p>
+    <w:p>
+      <w:pPr>
+        <w:spacing w:after="0"/>
+        <w:rPr>
+          <w:rFonts w:ascii="Arial" w:hAnsi="Arial" w:cs="Arial"/>
+          <w:b/>
+          <w:sz w:val="24"/>
+          <w:szCs w:val="24"/>
+        </w:rPr>
+      </w:pPr>
+      <w:r>
+        <w:rPr>
+          <w:rFonts w:ascii="Arial" w:hAnsi="Arial" w:cs="Arial"/>
+          <w:b/>
+          <w:sz w:val="24"/>
+          <w:szCs w:val="24"/>
+        </w:rPr>
+        <w:t>Tạo tài khoản Render.com</w:t>
+      </w:r>
+    </w:p>
+    <w:p>
+      <w:pPr>
+        <w:spacing w:after="0"/>
+        <w:rPr>
+          <w:rFonts w:ascii="Arial" w:hAnsi="Arial" w:cs="Arial"/>
+          <w:sz w:val="24"/>
+          <w:szCs w:val="24"/>
+        </w:rPr>
+      </w:pPr>
+    </w:p>
+    <w:p>
+      <w:pPr>
+        <w:spacing w:after="0"/>
+        <w:rPr>
+          <w:rFonts w:ascii="Arial" w:hAnsi="Arial" w:cs="Arial"/>
+          <w:sz w:val="24"/>
+          <w:szCs w:val="24"/>
+        </w:rPr>
+      </w:pPr>
+      <w:r>
+        <w:rPr>
+          <w:rFonts w:ascii="Arial" w:hAnsi="Arial" w:cs="Arial"/>
+          <w:sz w:val="24"/>
+          <w:szCs w:val="24"/>
+        </w:rPr>
+        <w:t>Lên render.com, tạo Web Service</w:t>
+      </w:r>
+    </w:p>
+    <w:p>
+      <w:pPr>
+        <w:spacing w:after="0"/>
+        <w:rPr>
+          <w:rFonts w:ascii="Arial" w:hAnsi="Arial" w:cs="Arial"/>
+          <w:sz w:val="24"/>
+          <w:szCs w:val="24"/>
+        </w:rPr>
+      </w:pPr>
+    </w:p>
+    <w:p>
+      <w:pPr>
+        <w:spacing w:after="0"/>
+        <w:jc w:val="center"/>
+        <w:rPr>
+          <w:rFonts w:ascii="Arial" w:hAnsi="Arial" w:cs="Arial"/>
+          <w:sz w:val="24"/>
+          <w:szCs w:val="24"/>
+        </w:rPr>
+      </w:pPr>
+      <w:r>
+        <w:rPr>
+          <w:rFonts w:ascii="Arial" w:hAnsi="Arial" w:cs="Arial"/>
+          <w:noProof/>
+          <w:sz w:val="24"/>
+          <w:szCs w:val="24"/>
+        </w:rPr>
+        <w:lastRenderedPageBreak/>
+        <w:drawing>
+          <wp:inline distT="0" distB="0" distL="0" distR="0">
+            <wp:extent cx="5257800" cy="2689196"/>
+            <wp:effectExtent l="0" t="0" r="0" b="0"/>
+            <wp:docPr id="20" name="Picture 20"/>
+            <wp:cNvGraphicFramePr>
+              <a:graphicFrameLocks xmlns:a="http://schemas.openxmlformats.org/drawingml/2006/main" noChangeAspect="1"/>
+            </wp:cNvGraphicFramePr>
+            <a:graphic xmlns:a="http://schemas.openxmlformats.org/drawingml/2006/main">
+              <a:graphicData uri="http://schemas.openxmlformats.org/drawingml/2006/picture">
+                <pic:pic xmlns:pic="http://schemas.openxmlformats.org/drawingml/2006/picture">
+                  <pic:nvPicPr>
+                    <pic:cNvPr id="0" name="Picture 9"/>
+                    <pic:cNvPicPr>
+                      <a:picLocks noChangeAspect="1" noChangeArrowheads="1"/>
+                    </pic:cNvPicPr>
+                  </pic:nvPicPr>
+                  <pic:blipFill>
+                    <a:blip r:embed="rId23">
+                      <a:extLst>
+                        <a:ext uri="{28A0092B-C50C-407E-A947-70E740481C1C}">
+                          <a14:useLocalDpi xmlns:a14="http://schemas.microsoft.com/office/drawing/2010/main" val="0"/>
+                        </a:ext>
+                      </a:extLst>
+                    </a:blip>
+                    <a:srcRect/>
+                    <a:stretch>
+                      <a:fillRect/>
+                    </a:stretch>
+                  </pic:blipFill>
+                  <pic:spPr bwMode="auto">
+                    <a:xfrm>
+                      <a:off x="0" y="0"/>
+                      <a:ext cx="5264390" cy="2692567"/>
+                    </a:xfrm>
+                    <a:prstGeom prst="rect">
+                      <a:avLst/>
+                    </a:prstGeom>
+                    <a:noFill/>
+                    <a:ln>
+                      <a:noFill/>
+                    </a:ln>
+                  </pic:spPr>
+                </pic:pic>
+              </a:graphicData>
+            </a:graphic>
+          </wp:inline>
+        </w:drawing>
+      </w:r>
+    </w:p>
+    <w:p>
+      <w:pPr>
+        <w:spacing w:after="0"/>
+        <w:rPr>
+          <w:rFonts w:ascii="Arial" w:hAnsi="Arial" w:cs="Arial"/>
+          <w:sz w:val="24"/>
+          <w:szCs w:val="24"/>
+        </w:rPr>
+      </w:pPr>
+    </w:p>
+    <w:p>
+      <w:pPr>
+        <w:spacing w:after="0"/>
+        <w:rPr>
+          <w:rFonts w:ascii="Arial" w:hAnsi="Arial" w:cs="Arial"/>
+          <w:sz w:val="24"/>
+          <w:szCs w:val="24"/>
+        </w:rPr>
+      </w:pPr>
+      <w:r>
+        <w:rPr>
+          <w:rFonts w:ascii="Arial" w:hAnsi="Arial" w:cs="Arial"/>
+          <w:sz w:val="24"/>
+          <w:szCs w:val="24"/>
+        </w:rPr>
+        <w:t>Chọn Existing Image</w:t>
+      </w:r>
+    </w:p>
+    <w:p>
+      <w:pPr>
+        <w:spacing w:after="0"/>
+        <w:rPr>
+          <w:rFonts w:ascii="Arial" w:hAnsi="Arial" w:cs="Arial"/>
+          <w:sz w:val="24"/>
+          <w:szCs w:val="24"/>
+        </w:rPr>
+      </w:pPr>
+      <w:r>
+        <w:rPr>
+          <w:rFonts w:ascii="Arial" w:hAnsi="Arial" w:cs="Arial"/>
+          <w:sz w:val="24"/>
+          <w:szCs w:val="24"/>
+        </w:rPr>
+        <w:t>Paste dòng:</w:t>
+      </w:r>
+    </w:p>
+    <w:p>
+      <w:pPr>
+        <w:spacing w:after="0"/>
+        <w:rPr>
+          <w:rFonts w:ascii="Arial" w:hAnsi="Arial" w:cs="Arial"/>
+          <w:sz w:val="24"/>
+          <w:szCs w:val="24"/>
+        </w:rPr>
+      </w:pPr>
+    </w:p>
+    <w:p>
+      <w:pPr>
+        <w:spacing w:after="0"/>
+        <w:rPr>
+          <w:rFonts w:ascii="Arial" w:hAnsi="Arial" w:cs="Arial"/>
+          <w:sz w:val="24"/>
+          <w:szCs w:val="24"/>
+        </w:rPr>
+      </w:pPr>
+      <w:r>
+        <w:rPr>
+          <w:rFonts w:ascii="Arial" w:hAnsi="Arial" w:cs="Arial"/>
+          <w:sz w:val="24"/>
+          <w:szCs w:val="24"/>
+        </w:rPr>
+        <w:t>docker.io/nvhai061993/account-service:1.0</w:t>
+      </w:r>
+    </w:p>
+    <w:p>
+      <w:pPr>
+        <w:spacing w:after="0"/>
+        <w:rPr>
+          <w:rFonts w:ascii="Arial" w:hAnsi="Arial" w:cs="Arial"/>
+          <w:sz w:val="24"/>
+          <w:szCs w:val="24"/>
+        </w:rPr>
+      </w:pPr>
+    </w:p>
+    <w:p>
+      <w:pPr>
+        <w:spacing w:after="0"/>
+        <w:jc w:val="center"/>
+        <w:rPr>
+          <w:rFonts w:ascii="Arial" w:hAnsi="Arial" w:cs="Arial"/>
+          <w:sz w:val="24"/>
+          <w:szCs w:val="24"/>
+        </w:rPr>
+      </w:pPr>
+      <w:r>
+        <w:rPr>
+          <w:rFonts w:ascii="Arial" w:hAnsi="Arial" w:cs="Arial"/>
+          <w:noProof/>
+          <w:sz w:val="24"/>
+          <w:szCs w:val="24"/>
+        </w:rPr>
+        <w:drawing>
+          <wp:inline distT="0" distB="0" distL="0" distR="0">
+            <wp:extent cx="3879359" cy="2720340"/>
+            <wp:effectExtent l="0" t="0" r="6985" b="3810"/>
+            <wp:docPr id="22" name="Picture 22"/>
+            <wp:cNvGraphicFramePr>
+              <a:graphicFrameLocks xmlns:a="http://schemas.openxmlformats.org/drawingml/2006/main" noChangeAspect="1"/>
+            </wp:cNvGraphicFramePr>
+            <a:graphic xmlns:a="http://schemas.openxmlformats.org/drawingml/2006/main">
+              <a:graphicData uri="http://schemas.openxmlformats.org/drawingml/2006/picture">
+                <pic:pic xmlns:pic="http://schemas.openxmlformats.org/drawingml/2006/picture">
+                  <pic:nvPicPr>
+                    <pic:cNvPr id="0" name="Picture 11"/>
+                    <pic:cNvPicPr>
+                      <a:picLocks noChangeAspect="1" noChangeArrowheads="1"/>
+                    </pic:cNvPicPr>
+                  </pic:nvPicPr>
+                  <pic:blipFill>
+                    <a:blip r:embed="rId24">
+                      <a:extLst>
+                        <a:ext uri="{28A0092B-C50C-407E-A947-70E740481C1C}">
+                          <a14:useLocalDpi xmlns:a14="http://schemas.microsoft.com/office/drawing/2010/main" val="0"/>
+                        </a:ext>
+                      </a:extLst>
+                    </a:blip>
+                    <a:srcRect/>
+                    <a:stretch>
+                      <a:fillRect/>
+                    </a:stretch>
+                  </pic:blipFill>
+                  <pic:spPr bwMode="auto">
+                    <a:xfrm>
+                      <a:off x="0" y="0"/>
+                      <a:ext cx="3884248" cy="2723768"/>
+                    </a:xfrm>
+                    <a:prstGeom prst="rect">
+                      <a:avLst/>
+                    </a:prstGeom>
+                    <a:noFill/>
+                    <a:ln>
+                      <a:noFill/>
+                    </a:ln>
+                  </pic:spPr>
+                </pic:pic>
+              </a:graphicData>
+            </a:graphic>
+          </wp:inline>
+        </w:drawing>
+      </w:r>
+    </w:p>
+    <w:p>
+      <w:pPr>
+        <w:spacing w:after="0"/>
+        <w:rPr>
+          <w:rFonts w:ascii="Arial" w:hAnsi="Arial" w:cs="Arial"/>
+          <w:sz w:val="24"/>
+          <w:szCs w:val="24"/>
+        </w:rPr>
+      </w:pPr>
+    </w:p>
+    <w:p>
+      <w:pPr>
+        <w:spacing w:after="0"/>
+        <w:rPr>
+          <w:rFonts w:ascii="Arial" w:hAnsi="Arial" w:cs="Arial"/>
+          <w:sz w:val="24"/>
+          <w:szCs w:val="24"/>
+        </w:rPr>
+      </w:pPr>
+      <w:r>
+        <w:rPr>
+          <w:rFonts w:ascii="Arial" w:hAnsi="Arial" w:cs="Arial"/>
+          <w:sz w:val="24"/>
+          <w:szCs w:val="24"/>
+        </w:rPr>
+        <w:t>Đặt tên cho web service</w:t>
+      </w:r>
+    </w:p>
+    <w:p>
+      <w:pPr>
+        <w:spacing w:after="0"/>
+        <w:rPr>
+          <w:rFonts w:ascii="Arial" w:hAnsi="Arial" w:cs="Arial"/>
+          <w:sz w:val="24"/>
+          <w:szCs w:val="24"/>
+        </w:rPr>
+      </w:pPr>
+      <w:r>
+        <w:rPr>
+          <w:rFonts w:ascii="Arial" w:hAnsi="Arial" w:cs="Arial"/>
+          <w:sz w:val="24"/>
+          <w:szCs w:val="24"/>
+        </w:rPr>
+        <w:t>Chọn Free</w:t>
+      </w:r>
+    </w:p>
+    <w:p>
+      <w:pPr>
+        <w:spacing w:after="0"/>
+        <w:rPr>
+          <w:rFonts w:ascii="Arial" w:hAnsi="Arial" w:cs="Arial"/>
+          <w:sz w:val="24"/>
+          <w:szCs w:val="24"/>
+        </w:rPr>
+      </w:pPr>
+    </w:p>
+    <w:p>
+      <w:pPr>
+        <w:spacing w:after="0"/>
+        <w:jc w:val="center"/>
+        <w:rPr>
+          <w:rFonts w:ascii="Arial" w:hAnsi="Arial" w:cs="Arial"/>
+          <w:sz w:val="24"/>
+          <w:szCs w:val="24"/>
+        </w:rPr>
+      </w:pPr>
+      <w:r>
+        <w:rPr>
+          <w:rFonts w:ascii="Arial" w:hAnsi="Arial" w:cs="Arial"/>
+          <w:noProof/>
+          <w:sz w:val="24"/>
+          <w:szCs w:val="24"/>
+        </w:rPr>
+        <w:drawing>
+          <wp:inline distT="0" distB="0" distL="0" distR="0">
+            <wp:extent cx="5311140" cy="2162219"/>
+            <wp:effectExtent l="0" t="0" r="3810" b="9525"/>
+            <wp:docPr id="23" name="Picture 23"/>
+            <wp:cNvGraphicFramePr>
+              <a:graphicFrameLocks xmlns:a="http://schemas.openxmlformats.org/drawingml/2006/main" noChangeAspect="1"/>
+            </wp:cNvGraphicFramePr>
+            <a:graphic xmlns:a="http://schemas.openxmlformats.org/drawingml/2006/main">
+              <a:graphicData uri="http://schemas.openxmlformats.org/drawingml/2006/picture">
+                <pic:pic xmlns:pic="http://schemas.openxmlformats.org/drawingml/2006/picture">
+                  <pic:nvPicPr>
+                    <pic:cNvPr id="0" name="Picture 12"/>
+                    <pic:cNvPicPr>
+                      <a:picLocks noChangeAspect="1" noChangeArrowheads="1"/>
+                    </pic:cNvPicPr>
+                  </pic:nvPicPr>
+                  <pic:blipFill>
+                    <a:blip r:embed="rId25">
+                      <a:extLst>
+                        <a:ext uri="{28A0092B-C50C-407E-A947-70E740481C1C}">
+                          <a14:useLocalDpi xmlns:a14="http://schemas.microsoft.com/office/drawing/2010/main" val="0"/>
+                        </a:ext>
+                      </a:extLst>
+                    </a:blip>
+                    <a:srcRect/>
+                    <a:stretch>
+                      <a:fillRect/>
+                    </a:stretch>
+                  </pic:blipFill>
+                  <pic:spPr bwMode="auto">
+                    <a:xfrm>
+                      <a:off x="0" y="0"/>
+                      <a:ext cx="5324795" cy="2167778"/>
+                    </a:xfrm>
+                    <a:prstGeom prst="rect">
+                      <a:avLst/>
+                    </a:prstGeom>
+                    <a:noFill/>
+                    <a:ln>
+                      <a:noFill/>
+                    </a:ln>
+                  </pic:spPr>
+                </pic:pic>
+              </a:graphicData>
+            </a:graphic>
+          </wp:inline>
+        </w:drawing>
+      </w:r>
+    </w:p>
+    <w:p>
+      <w:pPr>
+        <w:spacing w:after="0"/>
+        <w:rPr>
+          <w:rFonts w:ascii="Arial" w:hAnsi="Arial" w:cs="Arial"/>
+          <w:sz w:val="24"/>
+          <w:szCs w:val="24"/>
+        </w:rPr>
+      </w:pPr>
+    </w:p>
+    <w:p>
+      <w:pPr>
+        <w:spacing w:after="0"/>
+        <w:rPr>
+          <w:rFonts w:ascii="Arial" w:hAnsi="Arial" w:cs="Arial"/>
+          <w:sz w:val="24"/>
+          <w:szCs w:val="24"/>
+        </w:rPr>
+      </w:pPr>
+      <w:r>
+        <w:rPr>
+          <w:rFonts w:ascii="Arial" w:hAnsi="Arial" w:cs="Arial"/>
+          <w:sz w:val="24"/>
+          <w:szCs w:val="24"/>
+        </w:rPr>
+        <w:lastRenderedPageBreak/>
+        <w:t>Click Deploy và đợi</w:t>
+      </w:r>
+    </w:p>
+    <w:p>
+      <w:pPr>
+        <w:spacing w:after="0"/>
+        <w:rPr>
+          <w:rFonts w:ascii="Arial" w:hAnsi="Arial" w:cs="Arial"/>
+          <w:sz w:val="24"/>
+          <w:szCs w:val="24"/>
+        </w:rPr>
+      </w:pPr>
+    </w:p>
+    <w:p>
+      <w:pPr>
+        <w:spacing w:after="0"/>
+        <w:jc w:val="center"/>
+        <w:rPr>
+          <w:rFonts w:ascii="Arial" w:hAnsi="Arial" w:cs="Arial"/>
+          <w:sz w:val="24"/>
+          <w:szCs w:val="24"/>
+        </w:rPr>
+      </w:pPr>
+      <w:r>
+        <w:rPr>
+          <w:rFonts w:ascii="Arial" w:hAnsi="Arial" w:cs="Arial"/>
+          <w:noProof/>
+          <w:sz w:val="24"/>
+          <w:szCs w:val="24"/>
+        </w:rPr>
+        <w:drawing>
+          <wp:inline distT="0" distB="0" distL="0" distR="0">
+            <wp:extent cx="5372100" cy="3774656"/>
+            <wp:effectExtent l="0" t="0" r="0" b="0"/>
+            <wp:docPr id="24" name="Picture 24"/>
+            <wp:cNvGraphicFramePr>
+              <a:graphicFrameLocks xmlns:a="http://schemas.openxmlformats.org/drawingml/2006/main" noChangeAspect="1"/>
+            </wp:cNvGraphicFramePr>
+            <a:graphic xmlns:a="http://schemas.openxmlformats.org/drawingml/2006/main">
+              <a:graphicData uri="http://schemas.openxmlformats.org/drawingml/2006/picture">
+                <pic:pic xmlns:pic="http://schemas.openxmlformats.org/drawingml/2006/picture">
+                  <pic:nvPicPr>
+                    <pic:cNvPr id="0" name="Picture 13"/>
+                    <pic:cNvPicPr>
+                      <a:picLocks noChangeAspect="1" noChangeArrowheads="1"/>
+                    </pic:cNvPicPr>
+                  </pic:nvPicPr>
+                  <pic:blipFill>
+                    <a:blip r:embed="rId26">
+                      <a:extLst>
+                        <a:ext uri="{28A0092B-C50C-407E-A947-70E740481C1C}">
+                          <a14:useLocalDpi xmlns:a14="http://schemas.microsoft.com/office/drawing/2010/main" val="0"/>
+                        </a:ext>
+                      </a:extLst>
+                    </a:blip>
+                    <a:srcRect/>
+                    <a:stretch>
+                      <a:fillRect/>
+                    </a:stretch>
+                  </pic:blipFill>
+                  <pic:spPr bwMode="auto">
+                    <a:xfrm>
+                      <a:off x="0" y="0"/>
+                      <a:ext cx="5376327" cy="3777626"/>
+                    </a:xfrm>
+                    <a:prstGeom prst="rect">
+                      <a:avLst/>
+                    </a:prstGeom>
+                    <a:noFill/>
+                    <a:ln>
+                      <a:noFill/>
+                    </a:ln>
+                  </pic:spPr>
+                </pic:pic>
+              </a:graphicData>
+            </a:graphic>
+          </wp:inline>
+        </w:drawing>
+      </w:r>
+    </w:p>
+    <w:p>
+      <w:pPr>
+        <w:spacing w:after="0"/>
+        <w:rPr>
+          <w:rFonts w:ascii="Arial" w:hAnsi="Arial" w:cs="Arial"/>
+          <w:sz w:val="24"/>
+          <w:szCs w:val="24"/>
+        </w:rPr>
+      </w:pPr>
+    </w:p>
+    <w:p>
+      <w:pPr>
+        <w:spacing w:after="0"/>
+        <w:rPr>
+          <w:rFonts w:ascii="Arial" w:hAnsi="Arial" w:cs="Arial"/>
+          <w:sz w:val="24"/>
+          <w:szCs w:val="24"/>
+        </w:rPr>
+      </w:pPr>
+      <w:r>
+        <w:rPr>
+          <w:rFonts w:ascii="Arial" w:hAnsi="Arial" w:cs="Arial"/>
+          <w:sz w:val="24"/>
+          <w:szCs w:val="24"/>
+        </w:rPr>
+        <w:t>Nếu thấy kết quả là Your service is live thì bắt đầu thử các API</w:t>
+      </w:r>
+    </w:p>
+    <w:p>
+      <w:pPr>
+        <w:spacing w:after="0"/>
+        <w:rPr>
+          <w:rFonts w:ascii="Arial" w:hAnsi="Arial" w:cs="Arial"/>
+          <w:sz w:val="24"/>
+          <w:szCs w:val="24"/>
+        </w:rPr>
+      </w:pPr>
+    </w:p>
+    <w:p>
+      <w:pPr>
+        <w:spacing w:after="0"/>
+        <w:rPr>
+          <w:rFonts w:ascii="Arial" w:hAnsi="Arial" w:cs="Arial"/>
+          <w:sz w:val="24"/>
+          <w:szCs w:val="24"/>
+        </w:rPr>
+      </w:pPr>
+      <w:r>
+        <w:rPr>
+          <w:rFonts w:ascii="Arial" w:hAnsi="Arial" w:cs="Arial"/>
+          <w:noProof/>
+          <w:sz w:val="24"/>
+          <w:szCs w:val="24"/>
+        </w:rPr>
+        <w:drawing>
+          <wp:inline distT="0" distB="0" distL="0" distR="0">
+            <wp:extent cx="6644640" cy="1623060"/>
+            <wp:effectExtent l="0" t="0" r="3810" b="0"/>
+            <wp:docPr id="26" name="Picture 26"/>
+            <wp:cNvGraphicFramePr>
+              <a:graphicFrameLocks xmlns:a="http://schemas.openxmlformats.org/drawingml/2006/main" noChangeAspect="1"/>
+            </wp:cNvGraphicFramePr>
+            <a:graphic xmlns:a="http://schemas.openxmlformats.org/drawingml/2006/main">
+              <a:graphicData uri="http://schemas.openxmlformats.org/drawingml/2006/picture">
+                <pic:pic xmlns:pic="http://schemas.openxmlformats.org/drawingml/2006/picture">
+                  <pic:nvPicPr>
+                    <pic:cNvPr id="0" name="Picture 15"/>
+                    <pic:cNvPicPr>
+                      <a:picLocks noChangeAspect="1" noChangeArrowheads="1"/>
+                    </pic:cNvPicPr>
+                  </pic:nvPicPr>
+                  <pic:blipFill>
+                    <a:blip r:embed="rId27">
+                      <a:extLst>
+                        <a:ext uri="{28A0092B-C50C-407E-A947-70E740481C1C}">
+                          <a14:useLocalDpi xmlns:a14="http://schemas.microsoft.com/office/drawing/2010/main" val="0"/>
+                        </a:ext>
+                      </a:extLst>
+                    </a:blip>
+                    <a:srcRect/>
+                    <a:stretch>
+                      <a:fillRect/>
+                    </a:stretch>
+                  </pic:blipFill>
+                  <pic:spPr bwMode="auto">
+                    <a:xfrm>
+                      <a:off x="0" y="0"/>
+                      <a:ext cx="6644640" cy="1623060"/>
+                    </a:xfrm>
+                    <a:prstGeom prst="rect">
+                      <a:avLst/>
+                    </a:prstGeom>
+                    <a:noFill/>
+                    <a:ln>
+                      <a:noFill/>
+                    </a:ln>
+                  </pic:spPr>
+                </pic:pic>
+              </a:graphicData>
+            </a:graphic>
+          </wp:inline>
+        </w:drawing>
+      </w:r>
+    </w:p>
+    <w:p>
+      <w:pPr>
+        <w:spacing w:after="0"/>
+        <w:rPr>
+          <w:rFonts w:ascii="Arial" w:hAnsi="Arial" w:cs="Arial"/>
+          <w:sz w:val="24"/>
+          <w:szCs w:val="24"/>
+        </w:rPr>
+      </w:pPr>
+    </w:p>
+    <w:p>
+      <w:pPr>
+        <w:spacing w:after="0"/>
+        <w:rPr>
+          <w:rFonts w:ascii="Arial" w:hAnsi="Arial" w:cs="Arial"/>
+          <w:sz w:val="24"/>
+          <w:szCs w:val="24"/>
+        </w:rPr>
+      </w:pPr>
+      <w:r>
+        <w:rPr>
+          <w:rFonts w:ascii="Arial" w:hAnsi="Arial" w:cs="Arial"/>
+          <w:sz w:val="24"/>
+          <w:szCs w:val="24"/>
+        </w:rPr>
+        <w:t>Hãy xem dòng</w:t>
+      </w:r>
+    </w:p>
+    <w:p>
+      <w:pPr>
+        <w:spacing w:after="0"/>
+        <w:rPr>
+          <w:rFonts w:ascii="Arial" w:hAnsi="Arial" w:cs="Arial"/>
+          <w:sz w:val="24"/>
+          <w:szCs w:val="24"/>
+        </w:rPr>
+      </w:pPr>
+      <w:r>
+        <w:rPr>
+          <w:rFonts w:ascii="Arial" w:hAnsi="Arial" w:cs="Arial"/>
+          <w:sz w:val="24"/>
+          <w:szCs w:val="24"/>
+        </w:rPr>
+        <w:t>Available at your primary URL https://account-service-1-0-82fq.onrender.com</w:t>
+      </w:r>
+    </w:p>
+    <w:p>
+      <w:pPr>
+        <w:spacing w:after="0"/>
+        <w:rPr>
+          <w:rFonts w:ascii="Arial" w:hAnsi="Arial" w:cs="Arial"/>
+          <w:sz w:val="24"/>
+          <w:szCs w:val="24"/>
+        </w:rPr>
+      </w:pPr>
+    </w:p>
+    <w:p>
+      <w:pPr>
+        <w:spacing w:after="0"/>
+        <w:rPr>
+          <w:rFonts w:ascii="Arial" w:hAnsi="Arial" w:cs="Arial"/>
+          <w:sz w:val="24"/>
+          <w:szCs w:val="24"/>
+        </w:rPr>
+      </w:pPr>
+      <w:r>
+        <w:rPr>
+          <w:rFonts w:ascii="Arial" w:hAnsi="Arial" w:cs="Arial"/>
+          <w:sz w:val="24"/>
+          <w:szCs w:val="24"/>
+        </w:rPr>
+        <w:t>Đây là domain.</w:t>
+      </w:r>
+    </w:p>
+    <w:p>
+      <w:pPr>
+        <w:spacing w:after="0"/>
+        <w:rPr>
+          <w:rFonts w:ascii="Arial" w:hAnsi="Arial" w:cs="Arial"/>
+          <w:sz w:val="24"/>
+          <w:szCs w:val="24"/>
+        </w:rPr>
+      </w:pPr>
+      <w:r>
+        <w:rPr>
+          <w:rFonts w:ascii="Arial" w:hAnsi="Arial" w:cs="Arial"/>
+          <w:sz w:val="24"/>
+          <w:szCs w:val="24"/>
+        </w:rPr>
+        <w:t xml:space="preserve">Call API </w:t>
+      </w:r>
+      <w:r>
+        <w:rPr>
+          <w:rFonts w:ascii="Arial" w:hAnsi="Arial" w:cs="Arial"/>
+          <w:sz w:val="24"/>
+          <w:szCs w:val="24"/>
+        </w:rPr>
+        <w:t>https://account-service-1-0-82fq.onrender.com/api/v1/account/hello-world</w:t>
+      </w:r>
+    </w:p>
+    <w:p>
+      <w:pPr>
+        <w:spacing w:after="0"/>
+        <w:rPr>
+          <w:rFonts w:ascii="Arial" w:hAnsi="Arial" w:cs="Arial"/>
+          <w:sz w:val="24"/>
+          <w:szCs w:val="24"/>
+        </w:rPr>
+      </w:pPr>
+    </w:p>
+    <w:p>
+      <w:pPr>
+        <w:spacing w:after="0"/>
+        <w:jc w:val="center"/>
+        <w:rPr>
+          <w:rFonts w:ascii="Arial" w:hAnsi="Arial" w:cs="Arial"/>
+          <w:sz w:val="24"/>
+          <w:szCs w:val="24"/>
+        </w:rPr>
+      </w:pPr>
+      <w:r>
+        <w:rPr>
+          <w:rFonts w:ascii="Arial" w:hAnsi="Arial" w:cs="Arial"/>
+          <w:noProof/>
+          <w:sz w:val="24"/>
+          <w:szCs w:val="24"/>
+        </w:rPr>
+        <w:drawing>
+          <wp:inline distT="0" distB="0" distL="0" distR="0">
+            <wp:extent cx="6637020" cy="670560"/>
+            <wp:effectExtent l="0" t="0" r="0" b="0"/>
+            <wp:docPr id="27" name="Picture 27"/>
+            <wp:cNvGraphicFramePr>
+              <a:graphicFrameLocks xmlns:a="http://schemas.openxmlformats.org/drawingml/2006/main" noChangeAspect="1"/>
+            </wp:cNvGraphicFramePr>
+            <a:graphic xmlns:a="http://schemas.openxmlformats.org/drawingml/2006/main">
+              <a:graphicData uri="http://schemas.openxmlformats.org/drawingml/2006/picture">
+                <pic:pic xmlns:pic="http://schemas.openxmlformats.org/drawingml/2006/picture">
+                  <pic:nvPicPr>
+                    <pic:cNvPr id="0" name="Picture 16"/>
+                    <pic:cNvPicPr>
+                      <a:picLocks noChangeAspect="1" noChangeArrowheads="1"/>
+                    </pic:cNvPicPr>
+                  </pic:nvPicPr>
+                  <pic:blipFill>
+                    <a:blip r:embed="rId28">
+                      <a:extLst>
+                        <a:ext uri="{28A0092B-C50C-407E-A947-70E740481C1C}">
+                          <a14:useLocalDpi xmlns:a14="http://schemas.microsoft.com/office/drawing/2010/main" val="0"/>
+                        </a:ext>
+                      </a:extLst>
+                    </a:blip>
+                    <a:srcRect/>
+                    <a:stretch>
+                      <a:fillRect/>
+                    </a:stretch>
+                  </pic:blipFill>
+                  <pic:spPr bwMode="auto">
+                    <a:xfrm>
+                      <a:off x="0" y="0"/>
+                      <a:ext cx="6637020" cy="670560"/>
+                    </a:xfrm>
+                    <a:prstGeom prst="rect">
+                      <a:avLst/>
+                    </a:prstGeom>
+                    <a:noFill/>
+                    <a:ln>
+                      <a:noFill/>
+                    </a:ln>
+                  </pic:spPr>
+                </pic:pic>
+              </a:graphicData>
+            </a:graphic>
+          </wp:inline>
+        </w:drawing>
+      </w:r>
+    </w:p>
+    <w:p>
+      <w:pPr>
+        <w:spacing w:after="0"/>
+        <w:rPr>
+          <w:rFonts w:ascii="Arial" w:hAnsi="Arial" w:cs="Arial"/>
+          <w:sz w:val="24"/>
+          <w:szCs w:val="24"/>
+        </w:rPr>
+      </w:pPr>
+    </w:p>
+    <w:p>
+      <w:pPr>
+        <w:spacing w:after="0"/>
+        <w:rPr>
+          <w:rFonts w:ascii="Arial" w:hAnsi="Arial" w:cs="Arial"/>
+          <w:b/>
+          <w:sz w:val="24"/>
+          <w:szCs w:val="24"/>
+        </w:rPr>
+      </w:pPr>
+    </w:p>
+    <w:p>
+      <w:pPr>
+        <w:spacing w:after="0"/>
+        <w:rPr>
+          <w:rFonts w:ascii="Arial" w:hAnsi="Arial" w:cs="Arial"/>
+          <w:b/>
+          <w:sz w:val="24"/>
+          <w:szCs w:val="24"/>
+        </w:rPr>
+      </w:pPr>
+    </w:p>
+    <w:p>
+      <w:pPr>
+        <w:spacing w:after="0"/>
+        <w:rPr>
+          <w:rFonts w:ascii="Arial" w:hAnsi="Arial" w:cs="Arial"/>
+          <w:b/>
+          <w:sz w:val="24"/>
+          <w:szCs w:val="24"/>
+        </w:rPr>
+      </w:pPr>
+    </w:p>
+    <w:p>
+      <w:pPr>
+        <w:spacing w:after="0"/>
+        <w:rPr>
+          <w:rFonts w:ascii="Arial" w:hAnsi="Arial" w:cs="Arial"/>
+          <w:b/>
+          <w:sz w:val="24"/>
+          <w:szCs w:val="24"/>
+        </w:rPr>
+      </w:pPr>
+    </w:p>
+    <w:p>
+      <w:pPr>
+        <w:spacing w:after="0"/>
+        <w:rPr>
+          <w:rFonts w:ascii="Arial" w:hAnsi="Arial" w:cs="Arial"/>
+          <w:b/>
+          <w:sz w:val="24"/>
+          <w:szCs w:val="24"/>
+        </w:rPr>
+      </w:pPr>
+    </w:p>
+    <w:p>
+      <w:pPr>
+        <w:spacing w:after="0"/>
+        <w:rPr>
+          <w:rFonts w:ascii="Arial" w:hAnsi="Arial" w:cs="Arial"/>
+          <w:b/>
+          <w:sz w:val="24"/>
+          <w:szCs w:val="24"/>
+        </w:rPr>
+      </w:pPr>
+    </w:p>
+    <w:p>
+      <w:pPr>
+        <w:spacing w:after="0"/>
+        <w:rPr>
+          <w:rFonts w:ascii="Arial" w:hAnsi="Arial" w:cs="Arial"/>
+          <w:b/>
+          <w:sz w:val="24"/>
+          <w:szCs w:val="24"/>
+        </w:rPr>
+      </w:pPr>
+      <w:r>
+        <w:rPr>
+          <w:rFonts w:ascii="Arial" w:hAnsi="Arial" w:cs="Arial"/>
+          <w:b/>
+          <w:sz w:val="24"/>
+          <w:szCs w:val="24"/>
+        </w:rPr>
+        <w:lastRenderedPageBreak/>
+        <w:t>Deploy lại lần nữa</w:t>
+      </w:r>
+    </w:p>
+    <w:p>
+      <w:pPr>
+        <w:spacing w:after="0"/>
+        <w:rPr>
+          <w:rFonts w:ascii="Arial" w:hAnsi="Arial" w:cs="Arial"/>
+          <w:sz w:val="24"/>
+          <w:szCs w:val="24"/>
+        </w:rPr>
+      </w:pPr>
+    </w:p>
+    <w:p>
+      <w:pPr>
+        <w:spacing w:after="0"/>
+        <w:rPr>
+          <w:rFonts w:ascii="Arial" w:hAnsi="Arial" w:cs="Arial"/>
+          <w:sz w:val="24"/>
+          <w:szCs w:val="24"/>
+        </w:rPr>
+      </w:pPr>
+      <w:r>
+        <w:rPr>
+          <w:rFonts w:ascii="Arial" w:hAnsi="Arial" w:cs="Arial"/>
+          <w:sz w:val="24"/>
+          <w:szCs w:val="24"/>
+        </w:rPr>
+        <w:t>Chỉnh sửa nội dung API hello-world</w:t>
+      </w:r>
+    </w:p>
+    <w:p>
+      <w:pPr>
+        <w:spacing w:after="0"/>
+        <w:rPr>
+          <w:rFonts w:ascii="Arial" w:hAnsi="Arial" w:cs="Arial"/>
+          <w:sz w:val="24"/>
+          <w:szCs w:val="24"/>
+        </w:rPr>
+      </w:pPr>
+      <w:r>
+        <w:rPr>
+          <w:rFonts w:ascii="Arial" w:hAnsi="Arial" w:cs="Arial"/>
+          <w:sz w:val="24"/>
+          <w:szCs w:val="24"/>
+        </w:rPr>
+        <w:t>Tạo file jar</w:t>
+      </w:r>
+    </w:p>
+    <w:p>
+      <w:pPr>
+        <w:spacing w:after="0"/>
+        <w:rPr>
+          <w:rFonts w:ascii="Arial" w:hAnsi="Arial" w:cs="Arial"/>
+          <w:sz w:val="24"/>
+          <w:szCs w:val="24"/>
+        </w:rPr>
+      </w:pPr>
+      <w:r>
+        <w:rPr>
+          <w:rFonts w:ascii="Arial" w:hAnsi="Arial" w:cs="Arial"/>
+          <w:sz w:val="24"/>
+          <w:szCs w:val="24"/>
+        </w:rPr>
+        <w:t>Docker Image</w:t>
+      </w:r>
+    </w:p>
+    <w:p>
+      <w:pPr>
+        <w:spacing w:after="0"/>
+        <w:rPr>
+          <w:rFonts w:ascii="Arial" w:hAnsi="Arial" w:cs="Arial"/>
+          <w:sz w:val="24"/>
+          <w:szCs w:val="24"/>
+        </w:rPr>
+      </w:pPr>
+      <w:r>
+        <w:rPr>
+          <w:rFonts w:ascii="Arial" w:hAnsi="Arial" w:cs="Arial"/>
+          <w:sz w:val="24"/>
+          <w:szCs w:val="24"/>
+        </w:rPr>
+        <w:t>Push Image lên Docker Repository</w:t>
+      </w:r>
+    </w:p>
+    <w:p>
+      <w:pPr>
+        <w:spacing w:after="0"/>
+        <w:rPr>
+          <w:rFonts w:ascii="Arial" w:hAnsi="Arial" w:cs="Arial"/>
+          <w:sz w:val="24"/>
+          <w:szCs w:val="24"/>
+        </w:rPr>
+      </w:pPr>
+    </w:p>
+    <w:p>
+      <w:pPr>
+        <w:spacing w:after="0"/>
+        <w:rPr>
+          <w:rFonts w:ascii="Arial" w:hAnsi="Arial" w:cs="Arial"/>
+          <w:sz w:val="24"/>
+          <w:szCs w:val="24"/>
+        </w:rPr>
+      </w:pPr>
+      <w:r>
+        <w:rPr>
+          <w:rFonts w:ascii="Arial" w:hAnsi="Arial" w:cs="Arial"/>
+          <w:sz w:val="24"/>
+          <w:szCs w:val="24"/>
+        </w:rPr>
+        <w:t>Sau đó click Manual Deploy</w:t>
+      </w:r>
+      <w:r>
+        <w:rPr>
+          <w:rFonts w:ascii="Arial" w:hAnsi="Arial" w:cs="Arial"/>
+          <w:sz w:val="24"/>
+          <w:szCs w:val="24"/>
+        </w:rPr>
+        <w:t>, Deploy latest reference</w:t>
+      </w:r>
       <w:bookmarkStart w:id="0" w:name="_GoBack"/>
       <w:bookmarkEnd w:id="0"/>
+    </w:p>
+    <w:p>
+      <w:pPr>
+        <w:spacing w:after="0"/>
+        <w:rPr>
+          <w:rFonts w:ascii="Arial" w:hAnsi="Arial" w:cs="Arial"/>
+          <w:sz w:val="24"/>
+          <w:szCs w:val="24"/>
+        </w:rPr>
+      </w:pPr>
+    </w:p>
+    <w:p>
+      <w:pPr>
+        <w:spacing w:after="0"/>
+        <w:jc w:val="center"/>
+        <w:rPr>
+          <w:rFonts w:ascii="Arial" w:hAnsi="Arial" w:cs="Arial"/>
+          <w:sz w:val="24"/>
+          <w:szCs w:val="24"/>
+        </w:rPr>
+      </w:pPr>
+      <w:r>
+        <w:rPr>
+          <w:rFonts w:ascii="Arial" w:hAnsi="Arial" w:cs="Arial"/>
+          <w:noProof/>
+          <w:sz w:val="24"/>
+          <w:szCs w:val="24"/>
+        </w:rPr>
+        <w:drawing>
+          <wp:inline distT="0" distB="0" distL="0" distR="0">
+            <wp:extent cx="6301740" cy="2037948"/>
+            <wp:effectExtent l="0" t="0" r="3810" b="635"/>
+            <wp:docPr id="28" name="Picture 28"/>
+            <wp:cNvGraphicFramePr>
+              <a:graphicFrameLocks xmlns:a="http://schemas.openxmlformats.org/drawingml/2006/main" noChangeAspect="1"/>
+            </wp:cNvGraphicFramePr>
+            <a:graphic xmlns:a="http://schemas.openxmlformats.org/drawingml/2006/main">
+              <a:graphicData uri="http://schemas.openxmlformats.org/drawingml/2006/picture">
+                <pic:pic xmlns:pic="http://schemas.openxmlformats.org/drawingml/2006/picture">
+                  <pic:nvPicPr>
+                    <pic:cNvPr id="0" name="Picture 17"/>
+                    <pic:cNvPicPr>
+                      <a:picLocks noChangeAspect="1" noChangeArrowheads="1"/>
+                    </pic:cNvPicPr>
+                  </pic:nvPicPr>
+                  <pic:blipFill>
+                    <a:blip r:embed="rId29">
+                      <a:extLst>
+                        <a:ext uri="{28A0092B-C50C-407E-A947-70E740481C1C}">
+                          <a14:useLocalDpi xmlns:a14="http://schemas.microsoft.com/office/drawing/2010/main" val="0"/>
+                        </a:ext>
+                      </a:extLst>
+                    </a:blip>
+                    <a:srcRect/>
+                    <a:stretch>
+                      <a:fillRect/>
+                    </a:stretch>
+                  </pic:blipFill>
+                  <pic:spPr bwMode="auto">
+                    <a:xfrm>
+                      <a:off x="0" y="0"/>
+                      <a:ext cx="6311225" cy="2041015"/>
+                    </a:xfrm>
+                    <a:prstGeom prst="rect">
+                      <a:avLst/>
+                    </a:prstGeom>
+                    <a:noFill/>
+                    <a:ln>
+                      <a:noFill/>
+                    </a:ln>
+                  </pic:spPr>
+                </pic:pic>
+              </a:graphicData>
+            </a:graphic>
+          </wp:inline>
+        </w:drawing>
+      </w:r>
+    </w:p>
+    <w:p>
+      <w:pPr>
+        <w:spacing w:after="0"/>
+        <w:rPr>
+          <w:rFonts w:ascii="Arial" w:hAnsi="Arial" w:cs="Arial"/>
+          <w:sz w:val="24"/>
+          <w:szCs w:val="24"/>
+        </w:rPr>
+      </w:pPr>
+    </w:p>
+    <w:p>
+      <w:pPr>
+        <w:spacing w:after="0"/>
+        <w:rPr>
+          <w:rFonts w:ascii="Arial" w:hAnsi="Arial" w:cs="Arial"/>
+          <w:sz w:val="24"/>
+          <w:szCs w:val="24"/>
+        </w:rPr>
+      </w:pPr>
+    </w:p>
+    <w:p>
+      <w:pPr>
+        <w:spacing w:after="0"/>
+        <w:rPr>
+          <w:rFonts w:ascii="Arial" w:hAnsi="Arial" w:cs="Arial"/>
+          <w:sz w:val="24"/>
+          <w:szCs w:val="24"/>
+        </w:rPr>
+      </w:pPr>
+    </w:p>
+    <w:p>
+      <w:pPr>
+        <w:spacing w:after="0"/>
+        <w:rPr>
+          <w:rFonts w:ascii="Arial" w:hAnsi="Arial" w:cs="Arial"/>
+          <w:sz w:val="24"/>
+          <w:szCs w:val="24"/>
+        </w:rPr>
+      </w:pPr>
     </w:p>
     <w:p>
       <w:pPr>

</xml_diff>